<commit_message>
v2.6: tax x6 (planner about 70% with tax, nearly 0% without), Santiago, 5720 bytes
Co-Authored-By: Claude Sonnet 5.5 <noreply@anthropic.com>
Claude-Session: https://claude.ai/code/session_014MnrG7cc1Hws3poqmcDFnM
</commit_message>
<xml_diff>
--- a/instructions_v2.6.docx
+++ b/instructions_v2.6.docx
@@ -250,7 +250,7 @@
         <w:rPr>
           <w:lang w:val="en-GB"/>
         </w:rPr>
-        <w:t xml:space="preserve"> with a RAM module (CE-151 or larger). The recording holds the program without its REM lines (5726 bytes); with its variables it needs about 5.9 KB of memory, so it does not fit into a PC-1500 or PC-2 without a module.</w:t>
+        <w:t xml:space="preserve"> with a RAM module (CE-151 or larger). The recording holds the program without its REM lines (5720 bytes); with its variables it needs about 5.9 KB of memory, so it does not fit into a PC-1500 or PC-2 without a module.</w:t>
       </w:r>
     </w:p>
     <w:p>
@@ -2280,7 +2280,7 @@
               <w:keepNext/>
             </w:pPr>
             <w:r>
-              <w:t xml:space="preserve">Santiago de C.</w:t>
+              <w:t xml:space="preserve">Santiago</w:t>
             </w:r>
           </w:p>
         </w:tc>
@@ -4108,7 +4108,7 @@
         <w:rPr>
           <w:lang w:val="en-GB"/>
         </w:rPr>
-        <w:t xml:space="preserve">Every place you win adds three times the tokens you got for it to the </w:t>
+        <w:t xml:space="preserve">Every place you win adds six times the tokens you got for it to the </w:t>
       </w:r>
       <w:r>
         <w:rPr>

</xml_diff>

<commit_message>
v2.6: tax multiplier 5, tax mechanism no longer spelled out in the instructions
Co-Authored-By: Claude Sonnet 5.5 <noreply@anthropic.com>
Claude-Session: https://claude.ai/code/session_014MnrG7cc1Hws3poqmcDFnM
</commit_message>
<xml_diff>
--- a/instructions_v2.6.docx
+++ b/instructions_v2.6.docx
@@ -4108,26 +4108,13 @@
         <w:rPr>
           <w:lang w:val="en-GB"/>
         </w:rPr>
-        <w:t xml:space="preserve">Every place you win adds six times the tokens you got for it to the </w:t>
+        <w:t xml:space="preserve">The Tech Priests pay a tax on the places you have conquered – only on those, not on all places. The tax money waits for you until you press </w:t>
       </w:r>
       <w:r>
         <w:rPr>
           <w:b/>
           <w:lang w:val="en-GB"/>
         </w:rPr>
-        <w:t xml:space="preserve">tax money</w:t>
-      </w:r>
-      <w:r>
-        <w:rPr>
-          <w:lang w:val="en-GB"/>
-        </w:rPr>
-        <w:t xml:space="preserve"> (also when you win a place back). The tax money waits for you until you press </w:t>
-      </w:r>
-      <w:r>
-        <w:rPr>
-          <w:b/>
-          <w:lang w:val="en-GB"/>
-        </w:rPr>
         <w:t xml:space="preserve">T</w:t>
       </w:r>
       <w:r>
@@ -4147,7 +4134,7 @@
         <w:rPr>
           <w:lang w:val="en-GB"/>
         </w:rPr>
-        <w:t xml:space="preserve"> for about two and a half seconds. You can press T as often as you like; every time you get what has been collected since the last time, and nothing if you have won no places meanwhile. The tax is the main source of the tokens you need for places 7, 8 and 9. The first time you press T has a price: from then on the Tech Priests strike back (see the next section).</w:t>
+        <w:t xml:space="preserve"> for about two and a half seconds. You can press T as often as you like; every time you get what has been collected since the last time, and nothing if you have conquered no new places meanwhile. The tax is the main source of the tokens you need for places 7, 8 and 9. The first time you press T has a price: from then on the Tech Priests strike back (see the next section).</w:t>
       </w:r>
     </w:p>
     <w:p>

</xml_diff>